<commit_message>
Tareas binario 1 y 2 MME
</commit_message>
<xml_diff>
--- a/MME/Ejercicios de sistema decimal.docx
+++ b/MME/Ejercicios de sistema decimal.docx
@@ -279,25 +279,25 @@
       </w:pPr>
       <w:r>
         <w:rPr/>
-        <w:t xml:space="preserve">a) 4 × 10³ + 7 × 10² + 2 × 10¹ + 6 × 10⁰</w:t>
-      </w:r>
-    </w:p>
-    <w:p>
-      <w:pPr>
-        <w:spacing w:lineRule="auto"/>
-      </w:pPr>
-      <w:r>
-        <w:rPr/>
-        <w:t xml:space="preserve">b) 6 × 10⁴ + 3 × 10³ + 5 × 10² + 8 × 10⁰</w:t>
-      </w:r>
-    </w:p>
-    <w:p>
-      <w:pPr>
-        <w:spacing w:lineRule="auto"/>
-      </w:pPr>
-      <w:r>
-        <w:rPr/>
-        <w:t xml:space="preserve">c) 2 × 10⁵ + 4 × 10³ + 7 × 10¹ + 9 × 10⁰</w:t>
+        <w:t xml:space="preserve">a) 4 × 10³ + 7 × 10² + 2 × 10¹ + 6 × 10⁰ = 4726</w:t>
+      </w:r>
+    </w:p>
+    <w:p>
+      <w:pPr>
+        <w:spacing w:lineRule="auto"/>
+      </w:pPr>
+      <w:r>
+        <w:rPr/>
+        <w:t xml:space="preserve">b) 6 × 10⁴ + 3 × 10³ + 5 × 10² + 8 × 10⁰ = 63508</w:t>
+      </w:r>
+    </w:p>
+    <w:p>
+      <w:pPr>
+        <w:spacing w:lineRule="auto"/>
+      </w:pPr>
+      <w:r>
+        <w:rPr/>
+        <w:t xml:space="preserve">c) 2 × 10⁵ + 4 × 10³ + 7 × 10¹ + 9 × 10⁰ = 204079</w:t>
       </w:r>
     </w:p>
     <w:p>
@@ -335,16 +335,16 @@
       </w:pPr>
       <w:r>
         <w:rPr/>
-        <w:t xml:space="preserve">a) 7.254 = 7 × ___ + 2 × ___ + 5 × ___ + 4 × ___</w:t>
-      </w:r>
-    </w:p>
-    <w:p>
-      <w:pPr>
-        <w:spacing w:lineRule="auto"/>
-      </w:pPr>
-      <w:r>
-        <w:rPr/>
-        <w:t xml:space="preserve">b) 36.801 = 3 × ___ + 6 × ___ + 8 × ___ + 0 × ___ + 1 × ___</w:t>
+        <w:t xml:space="preserve">a) 7.254 = 7*10^3 + 2*10^2 + 5*10^1 + 4*10^0</w:t>
+      </w:r>
+    </w:p>
+    <w:p>
+      <w:pPr>
+        <w:spacing w:lineRule="auto"/>
+      </w:pPr>
+      <w:r>
+        <w:rPr/>
+        <w:t xml:space="preserve">b) 36.801 = 3*10^4 + 6*10^3 + 8*10^2 + 0*10^1 + 1*10^0</w:t>
       </w:r>
     </w:p>
     <w:p>
@@ -365,6 +365,24 @@
           <w:b/>
         </w:rPr>
         <w:t xml:space="preserve">5. Explica qué es un sistema de numeración</w:t>
+      </w:r>
+    </w:p>
+    <w:p>
+      <w:pPr>
+        <w:spacing w:lineRule="auto"/>
+      </w:pPr>
+      <w:r>
+        <w:rPr/>
+        <w:br w:type="textWrapping"/>
+      </w:r>
+    </w:p>
+    <w:p>
+      <w:pPr>
+        <w:spacing w:lineRule="auto"/>
+      </w:pPr>
+      <w:r>
+        <w:rPr/>
+        <w:t xml:space="preserve">Un sistema de numeración es un conjunto de símbolos que junto con unas reglas pueden usarse para expresar cualquier número válido.</w:t>
       </w:r>
     </w:p>
   </w:body>

</xml_diff>